<commit_message>
Added missing-ingredients retry flow
</commit_message>
<xml_diff>
--- a/docs/CapstoneReportAllerScan - ManavPatel.docx
+++ b/docs/CapstoneReportAllerScan - ManavPatel.docx
@@ -322,7 +322,7 @@
           <w:sz w:val="28"/>
           <w:szCs w:val="28"/>
         </w:rPr>
-        <w:t>with support for both English and French ingredient labels.</w:t>
+        <w:t>with support for both English and French ingredient labels</w:t>
       </w:r>
       <w:r>
         <w:rPr>
@@ -1043,23 +1043,7 @@
           <w:sz w:val="28"/>
           <w:szCs w:val="28"/>
         </w:rPr>
-        <w:t xml:space="preserve"> (bundled </w:t>
-      </w:r>
-      <w:proofErr w:type="spellStart"/>
-      <w:r>
-        <w:rPr>
-          <w:sz w:val="28"/>
-          <w:szCs w:val="28"/>
-        </w:rPr>
-        <w:t>tessdata</w:t>
-      </w:r>
-      <w:proofErr w:type="spellEnd"/>
-      <w:r>
-        <w:rPr>
-          <w:sz w:val="28"/>
-          <w:szCs w:val="28"/>
-        </w:rPr>
-        <w:t xml:space="preserve"> configs per language).”</w:t>
+        <w:t xml:space="preserve"> (bundled tessdata configs per language).”</w:t>
       </w:r>
     </w:p>
     <w:p>
@@ -1081,7 +1065,6 @@
         </w:rPr>
         <w:t>Image handling: ‘</w:t>
       </w:r>
-      <w:proofErr w:type="spellStart"/>
       <w:r>
         <w:rPr>
           <w:sz w:val="28"/>
@@ -1089,7 +1072,6 @@
         </w:rPr>
         <w:t>image_picker</w:t>
       </w:r>
-      <w:proofErr w:type="spellEnd"/>
       <w:r>
         <w:rPr>
           <w:sz w:val="28"/>
@@ -1201,7 +1183,6 @@
         </w:rPr>
         <w:t>‘</w:t>
       </w:r>
-      <w:proofErr w:type="spellStart"/>
       <w:r>
         <w:rPr>
           <w:sz w:val="28"/>
@@ -1209,7 +1190,6 @@
         </w:rPr>
         <w:t>shared_preferences</w:t>
       </w:r>
-      <w:proofErr w:type="spellEnd"/>
       <w:r>
         <w:rPr>
           <w:sz w:val="28"/>
@@ -1384,7 +1364,23 @@
           <w:sz w:val="28"/>
           <w:szCs w:val="28"/>
         </w:rPr>
-        <w:t>Confidence heuristics to prioritise high-certainty matches and drop duplicates.</w:t>
+        <w:t xml:space="preserve">Confidence heuristics to prioritise </w:t>
+      </w:r>
+      <w:proofErr w:type="gramStart"/>
+      <w:r>
+        <w:rPr>
+          <w:sz w:val="28"/>
+          <w:szCs w:val="28"/>
+        </w:rPr>
+        <w:t>high-certainty</w:t>
+      </w:r>
+      <w:proofErr w:type="gramEnd"/>
+      <w:r>
+        <w:rPr>
+          <w:sz w:val="28"/>
+          <w:szCs w:val="28"/>
+        </w:rPr>
+        <w:t xml:space="preserve"> matches and drop duplicates.</w:t>
       </w:r>
     </w:p>
     <w:p>
@@ -1881,7 +1877,23 @@
           <w:sz w:val="28"/>
           <w:szCs w:val="28"/>
         </w:rPr>
-        <w:t>English/French JSON sources are filtered through the user’s saved allergen list so only relevant hits appear.</w:t>
+        <w:t xml:space="preserve">English/French JSON sources are filtered through the user’s saved allergen </w:t>
+      </w:r>
+      <w:proofErr w:type="gramStart"/>
+      <w:r>
+        <w:rPr>
+          <w:sz w:val="28"/>
+          <w:szCs w:val="28"/>
+        </w:rPr>
+        <w:t>list</w:t>
+      </w:r>
+      <w:proofErr w:type="gramEnd"/>
+      <w:r>
+        <w:rPr>
+          <w:sz w:val="28"/>
+          <w:szCs w:val="28"/>
+        </w:rPr>
+        <w:t xml:space="preserve"> so only relevant hits appear.</w:t>
       </w:r>
     </w:p>
     <w:p>
@@ -3252,7 +3264,23 @@
           <w:sz w:val="28"/>
           <w:szCs w:val="28"/>
         </w:rPr>
-        <w:t xml:space="preserve">AllerScan stores each user’s allergens, custom entries, language choice, and emoji avatar in SharedPreferences via ProfileService. Onboarding saves the profile, the profile screen updates </w:t>
+        <w:t xml:space="preserve">AllerScan stores each user’s allergens, custom entries, language choice, and emoji avatar in SharedPreferences via ProfileService. Onboarding saves the </w:t>
+      </w:r>
+      <w:proofErr w:type="gramStart"/>
+      <w:r>
+        <w:rPr>
+          <w:sz w:val="28"/>
+          <w:szCs w:val="28"/>
+        </w:rPr>
+        <w:t>profile,</w:t>
+      </w:r>
+      <w:proofErr w:type="gramEnd"/>
+      <w:r>
+        <w:rPr>
+          <w:sz w:val="28"/>
+          <w:szCs w:val="28"/>
+        </w:rPr>
+        <w:t xml:space="preserve"> the profile screen updates </w:t>
       </w:r>
       <w:r>
         <w:rPr>

</xml_diff>